<commit_message>
bo sung sprint 3
</commit_message>
<xml_diff>
--- a/Tài Liệu/SCI_SE_01_Prososal.docx
+++ b/Tài Liệu/SCI_SE_01_Prososal.docx
@@ -1030,8 +1030,9 @@
           <w:b/>
           <w:sz w:val="32"/>
           <w:szCs w:val="36"/>
-        </w:rPr>
-        <w:t>03</w:t>
+          <w:lang w:val="vi-VN"/>
+        </w:rPr>
+        <w:t>06</w:t>
       </w:r>
       <w:r>
         <w:rPr>
@@ -1051,7 +1052,7 @@
           <w:szCs w:val="36"/>
           <w:lang w:val="vi-VN"/>
         </w:rPr>
-        <w:t>2026.</w:t>
+        <w:t>2026</w:t>
       </w:r>
     </w:p>
     <w:p>
@@ -1528,7 +1529,7 @@
                 <w:szCs w:val="26"/>
                 <w:lang w:val="vi-VN"/>
               </w:rPr>
-              <w:t>18</w:t>
+              <w:t>10</w:t>
             </w:r>
             <w:r>
               <w:rPr>
@@ -7700,6 +7701,8 @@
               </w:rPr>
               <w:tab/>
             </w:r>
+            <w:bookmarkStart w:id="0" w:name="_GoBack"/>
+            <w:bookmarkEnd w:id="0"/>
             <w:r>
               <w:rPr>
                 <w:rFonts w:ascii="Times New Roman" w:hAnsi="Times New Roman" w:cs="Times New Roman"/>
@@ -8489,14 +8492,14 @@
           <w:lang w:val="en"/>
         </w:rPr>
       </w:pPr>
-      <w:bookmarkStart w:id="0" w:name="_Toc66633608"/>
-      <w:bookmarkStart w:id="1" w:name="_Toc8386568"/>
-      <w:bookmarkStart w:id="2" w:name="_Toc58795842"/>
-      <w:bookmarkStart w:id="3" w:name="_Toc59708267"/>
-      <w:bookmarkStart w:id="4" w:name="_Toc59103950"/>
-      <w:bookmarkStart w:id="5" w:name="_Toc68719786"/>
-      <w:bookmarkStart w:id="6" w:name="_Toc66633646"/>
-      <w:bookmarkStart w:id="7" w:name="_Toc177035175"/>
+      <w:bookmarkStart w:id="1" w:name="_Toc66633608"/>
+      <w:bookmarkStart w:id="2" w:name="_Toc8386568"/>
+      <w:bookmarkStart w:id="3" w:name="_Toc58795842"/>
+      <w:bookmarkStart w:id="4" w:name="_Toc59708267"/>
+      <w:bookmarkStart w:id="5" w:name="_Toc59103950"/>
+      <w:bookmarkStart w:id="6" w:name="_Toc68719786"/>
+      <w:bookmarkStart w:id="7" w:name="_Toc66633646"/>
+      <w:bookmarkStart w:id="8" w:name="_Toc177035175"/>
       <w:r>
         <w:rPr>
           <w:rFonts w:ascii="Times New Roman" w:hAnsi="Times New Roman" w:cs="Times New Roman"/>
@@ -8519,8 +8522,8 @@
           <w:rFonts w:ascii="Times New Roman" w:hAnsi="Times New Roman" w:cs="Times New Roman"/>
         </w:rPr>
       </w:pPr>
-      <w:bookmarkStart w:id="8" w:name="_Toc207917645"/>
-      <w:bookmarkStart w:id="9" w:name="_Hlk207407526"/>
+      <w:bookmarkStart w:id="9" w:name="_Toc207917645"/>
+      <w:bookmarkStart w:id="10" w:name="_Hlk207407526"/>
       <w:r>
         <w:rPr>
           <w:rFonts w:ascii="Times New Roman" w:hAnsi="Times New Roman" w:cs="Times New Roman"/>
@@ -8528,7 +8531,6 @@
         <w:lastRenderedPageBreak/>
         <w:t>GIỚI THIỆU</w:t>
       </w:r>
-      <w:bookmarkEnd w:id="0"/>
       <w:bookmarkEnd w:id="1"/>
       <w:bookmarkEnd w:id="2"/>
       <w:bookmarkEnd w:id="3"/>
@@ -8537,26 +8539,26 @@
       <w:bookmarkEnd w:id="6"/>
       <w:bookmarkEnd w:id="7"/>
       <w:bookmarkEnd w:id="8"/>
+      <w:bookmarkEnd w:id="9"/>
     </w:p>
     <w:p>
       <w:pPr>
         <w:pStyle w:val="Heading2"/>
         <w:spacing w:before="0" w:after="0" w:line="360" w:lineRule="auto"/>
       </w:pPr>
-      <w:bookmarkStart w:id="10" w:name="_Toc8386569"/>
-      <w:bookmarkStart w:id="11" w:name="_Toc58795843"/>
-      <w:bookmarkStart w:id="12" w:name="_Toc59103951"/>
-      <w:bookmarkStart w:id="13" w:name="_Toc68719787"/>
-      <w:bookmarkStart w:id="14" w:name="_Toc59708268"/>
-      <w:bookmarkStart w:id="15" w:name="_Toc66633609"/>
-      <w:bookmarkStart w:id="16" w:name="_Toc177035176"/>
-      <w:bookmarkStart w:id="17" w:name="_Toc513987700"/>
-      <w:bookmarkStart w:id="18" w:name="_Toc66633647"/>
-      <w:bookmarkStart w:id="19" w:name="_Toc207917646"/>
+      <w:bookmarkStart w:id="11" w:name="_Toc8386569"/>
+      <w:bookmarkStart w:id="12" w:name="_Toc58795843"/>
+      <w:bookmarkStart w:id="13" w:name="_Toc59103951"/>
+      <w:bookmarkStart w:id="14" w:name="_Toc68719787"/>
+      <w:bookmarkStart w:id="15" w:name="_Toc59708268"/>
+      <w:bookmarkStart w:id="16" w:name="_Toc66633609"/>
+      <w:bookmarkStart w:id="17" w:name="_Toc177035176"/>
+      <w:bookmarkStart w:id="18" w:name="_Toc513987700"/>
+      <w:bookmarkStart w:id="19" w:name="_Toc66633647"/>
+      <w:bookmarkStart w:id="20" w:name="_Toc207917646"/>
       <w:r>
         <w:t>1.1 Mục đích</w:t>
       </w:r>
-      <w:bookmarkEnd w:id="10"/>
       <w:bookmarkEnd w:id="11"/>
       <w:bookmarkEnd w:id="12"/>
       <w:bookmarkEnd w:id="13"/>
@@ -8566,6 +8568,7 @@
       <w:bookmarkEnd w:id="17"/>
       <w:bookmarkEnd w:id="18"/>
       <w:bookmarkEnd w:id="19"/>
+      <w:bookmarkEnd w:id="20"/>
     </w:p>
     <w:p>
       <w:pPr>
@@ -8583,7 +8586,23 @@
           <w:sz w:val="26"/>
           <w:szCs w:val="26"/>
         </w:rPr>
-        <w:t>Trong những năm gần đây, cùng với sự phát triển mạnh mẽ của công nghệ thông tin và thương mại điện tử, nhu cầu đặt mua đồ ăn trực tuyến ngày càng gia tăng, đặc biệt tại các thành phố lớn như Đà Nẵng, TP. Hồ Chí Minh, Hà Nội,... Người dùng không chỉ mong muốn đặt món nhanh chóng, tiện lợi mà còn có nhu cầu tham khảo đánh giá và chia sẻ trải nghiệm ẩm thực với cộng đồng.</w:t>
+        <w:t xml:space="preserve">Trong những năm gần đây, cùng với sự phát triển mạnh mẽ của công nghệ thông tin và thương mại điện tử, nhu cầu đặt mua đồ ăn trực tuyến ngày càng gia tăng, đặc biệt tại các thành phố lớn như Đà Nẵng, TP. Hồ Chí Minh, Hà </w:t>
+      </w:r>
+      <w:proofErr w:type="gramStart"/>
+      <w:r>
+        <w:rPr>
+          <w:sz w:val="26"/>
+          <w:szCs w:val="26"/>
+        </w:rPr>
+        <w:t>Nội,...</w:t>
+      </w:r>
+      <w:proofErr w:type="gramEnd"/>
+      <w:r>
+        <w:rPr>
+          <w:sz w:val="26"/>
+          <w:szCs w:val="26"/>
+        </w:rPr>
+        <w:t xml:space="preserve"> Người dùng không chỉ mong muốn đặt món nhanh chóng, tiện lợi mà còn có nhu cầu tham khảo đánh giá và chia sẻ trải nghiệm ẩm thực với cộng đồng.</w:t>
       </w:r>
     </w:p>
     <w:p>
@@ -8636,6 +8655,7 @@
         </w:rPr>
         <w:t xml:space="preserve">” </w:t>
       </w:r>
+      <w:proofErr w:type="gramStart"/>
       <w:r>
         <w:rPr>
           <w:sz w:val="26"/>
@@ -8656,7 +8676,15 @@
           <w:sz w:val="26"/>
           <w:szCs w:val="26"/>
         </w:rPr>
-        <w:t>một nền tảng kết hợp giữa mạng xã hội và mua bán đồ ăn trực tuyến, hệ thống giúp các cửa hàng, quán ăn hoặc cá nhân kinh doanh ẩm thực có thêm một kênh quảng bá và bán sản phẩm hiệu quả thông qua các tính năng như đăng bài giới thiệu món ăn và tương tác với khách hàng.</w:t>
+        <w:t>một</w:t>
+      </w:r>
+      <w:proofErr w:type="gramEnd"/>
+      <w:r>
+        <w:rPr>
+          <w:sz w:val="26"/>
+          <w:szCs w:val="26"/>
+        </w:rPr>
+        <w:t xml:space="preserve"> nền tảng kết hợp giữa mạng xã hội và mua bán đồ ăn trực tuyến, hệ thống giúp các cửa hàng, quán ăn hoặc cá nhân kinh doanh ẩm thực có thêm một kênh quảng bá và bán sản phẩm hiệu quả thông qua các tính năng như đăng bài giới thiệu món ăn và tương tác với khách hàng.</w:t>
       </w:r>
     </w:p>
     <w:p>
@@ -8712,8 +8740,8 @@
           <w:lang w:val="vi-VN"/>
         </w:rPr>
       </w:pPr>
-      <w:bookmarkStart w:id="20" w:name="_Toc207917647"/>
-      <w:bookmarkEnd w:id="9"/>
+      <w:bookmarkStart w:id="21" w:name="_Toc207917647"/>
+      <w:bookmarkEnd w:id="10"/>
       <w:r>
         <w:rPr>
           <w:lang w:val="en"/>
@@ -8738,7 +8766,7 @@
         </w:rPr>
         <w:t>ạm vi</w:t>
       </w:r>
-      <w:bookmarkEnd w:id="20"/>
+      <w:bookmarkEnd w:id="21"/>
     </w:p>
     <w:p>
       <w:pPr>
@@ -9219,6 +9247,7 @@
         </w:rPr>
         <w:t xml:space="preserve">yêu </w:t>
       </w:r>
+      <w:proofErr w:type="gramStart"/>
       <w:r>
         <w:rPr>
           <w:rFonts w:ascii="Times New Roman" w:hAnsi="Times New Roman" w:cs="Times New Roman"/>
@@ -9235,7 +9264,17 @@
           <w:szCs w:val="26"/>
           <w:lang w:val="en"/>
         </w:rPr>
-        <w:t>, bình luận, theo dõi người dùng/gian hàng khác.</w:t>
+        <w:t>,</w:t>
+      </w:r>
+      <w:proofErr w:type="gramEnd"/>
+      <w:r>
+        <w:rPr>
+          <w:rFonts w:ascii="Times New Roman" w:hAnsi="Times New Roman" w:cs="Times New Roman"/>
+          <w:sz w:val="26"/>
+          <w:szCs w:val="26"/>
+          <w:lang w:val="en"/>
+        </w:rPr>
+        <w:t xml:space="preserve"> bình luận, theo dõi người dùng/gian hàng khác.</w:t>
       </w:r>
     </w:p>
     <w:p>
@@ -9633,7 +9672,27 @@
           <w:szCs w:val="26"/>
           <w:lang w:val="en"/>
         </w:rPr>
-        <w:t>Quản lý đơn hàng và cập nhật trạng thái xử lý đơn (xác nhận, đang chuẩn bị, đã giao,...).</w:t>
+        <w:t xml:space="preserve">Quản lý đơn hàng và cập nhật trạng thái xử lý đơn (xác nhận, đang chuẩn bị, đã </w:t>
+      </w:r>
+      <w:proofErr w:type="gramStart"/>
+      <w:r>
+        <w:rPr>
+          <w:rFonts w:ascii="Times New Roman" w:hAnsi="Times New Roman" w:cs="Times New Roman"/>
+          <w:sz w:val="26"/>
+          <w:szCs w:val="26"/>
+          <w:lang w:val="en"/>
+        </w:rPr>
+        <w:t>giao,...</w:t>
+      </w:r>
+      <w:proofErr w:type="gramEnd"/>
+      <w:r>
+        <w:rPr>
+          <w:rFonts w:ascii="Times New Roman" w:hAnsi="Times New Roman" w:cs="Times New Roman"/>
+          <w:sz w:val="26"/>
+          <w:szCs w:val="26"/>
+          <w:lang w:val="en"/>
+        </w:rPr>
+        <w:t>).</w:t>
       </w:r>
     </w:p>
     <w:p>
@@ -10055,7 +10114,7 @@
         </w:rPr>
         <w:t>/khiếu nại.</w:t>
       </w:r>
-      <w:bookmarkStart w:id="21" w:name="_Toc207917648"/>
+      <w:bookmarkStart w:id="22" w:name="_Toc207917648"/>
     </w:p>
     <w:p>
       <w:pPr>
@@ -10077,7 +10136,7 @@
         </w:rPr>
         <w:t>ảo</w:t>
       </w:r>
-      <w:bookmarkEnd w:id="21"/>
+      <w:bookmarkEnd w:id="22"/>
     </w:p>
     <w:p>
       <w:pPr>
@@ -10800,7 +10859,7 @@
         <w:pStyle w:val="Heading1"/>
         <w:spacing w:before="0" w:after="0" w:line="360" w:lineRule="auto"/>
       </w:pPr>
-      <w:bookmarkStart w:id="22" w:name="_Toc207917649"/>
+      <w:bookmarkStart w:id="23" w:name="_Toc207917649"/>
       <w:r>
         <w:t>2</w:t>
       </w:r>
@@ -10810,14 +10869,14 @@
       <w:r>
         <w:t>TỔNG QUAN DỰ ÁN</w:t>
       </w:r>
-      <w:bookmarkEnd w:id="22"/>
+      <w:bookmarkEnd w:id="23"/>
     </w:p>
     <w:p>
       <w:pPr>
         <w:pStyle w:val="Heading2"/>
         <w:spacing w:before="0" w:after="0" w:line="360" w:lineRule="auto"/>
       </w:pPr>
-      <w:bookmarkStart w:id="23" w:name="_Toc207917650"/>
+      <w:bookmarkStart w:id="24" w:name="_Toc207917650"/>
       <w:r>
         <w:rPr>
           <w:lang w:val="en"/>
@@ -10833,7 +10892,7 @@
       <w:r>
         <w:t>ài</w:t>
       </w:r>
-      <w:bookmarkEnd w:id="23"/>
+      <w:bookmarkEnd w:id="24"/>
     </w:p>
     <w:p>
       <w:pPr>
@@ -10846,7 +10905,7 @@
           <w:szCs w:val="26"/>
         </w:rPr>
       </w:pPr>
-      <w:bookmarkStart w:id="24" w:name="_Toc207917651"/>
+      <w:bookmarkStart w:id="25" w:name="_Toc207917651"/>
       <w:r>
         <w:rPr>
           <w:sz w:val="26"/>
@@ -10938,7 +10997,7 @@
       <w:r>
         <w:t>án</w:t>
       </w:r>
-      <w:bookmarkEnd w:id="24"/>
+      <w:bookmarkEnd w:id="25"/>
     </w:p>
     <w:p>
       <w:pPr>
@@ -11005,7 +11064,7 @@
           <w:lang w:val="vi-VN"/>
         </w:rPr>
       </w:pPr>
-      <w:bookmarkStart w:id="25" w:name="_Toc207917652"/>
+      <w:bookmarkStart w:id="26" w:name="_Toc207917652"/>
       <w:r>
         <w:rPr>
           <w:lang w:val="en"/>
@@ -11027,7 +11086,7 @@
         </w:rPr>
         <w:t>ề xuất</w:t>
       </w:r>
-      <w:bookmarkEnd w:id="25"/>
+      <w:bookmarkEnd w:id="26"/>
     </w:p>
     <w:p>
       <w:pPr>
@@ -11108,7 +11167,7 @@
         <w:tab/>
         <w:t xml:space="preserve">   </w:t>
       </w:r>
-      <w:bookmarkStart w:id="26" w:name="_Toc207917653"/>
+      <w:bookmarkStart w:id="27" w:name="_Toc207917653"/>
       <w:r>
         <w:rPr>
           <w:lang w:val="en"/>
@@ -11133,7 +11192,7 @@
       <w:r>
         <w:t>án</w:t>
       </w:r>
-      <w:bookmarkEnd w:id="26"/>
+      <w:bookmarkEnd w:id="27"/>
     </w:p>
     <w:p>
       <w:pPr>
@@ -11470,7 +11529,7 @@
         <w:lastRenderedPageBreak/>
         <w:t xml:space="preserve">   </w:t>
       </w:r>
-      <w:bookmarkStart w:id="27" w:name="_Toc207917654"/>
+      <w:bookmarkStart w:id="28" w:name="_Toc207917654"/>
       <w:r>
         <w:rPr>
           <w:lang w:val="en"/>
@@ -11483,7 +11542,7 @@
         </w:rPr>
         <w:t>ạt động của ứng dụng</w:t>
       </w:r>
-      <w:bookmarkEnd w:id="27"/>
+      <w:bookmarkEnd w:id="28"/>
     </w:p>
     <w:p>
       <w:pPr>
@@ -11506,9 +11565,9 @@
           <w:lang w:val="vi-VN" w:eastAsia="vi-VN"/>
         </w:rPr>
         <w:drawing>
-          <wp:inline distT="0" distB="0" distL="0" distR="0" wp14:anchorId="30F9C8E4" wp14:editId="4DBDE2D8">
-            <wp:extent cx="4906060" cy="3315163"/>
-            <wp:effectExtent l="0" t="0" r="8890" b="0"/>
+          <wp:inline distT="0" distB="0" distL="0" distR="0" wp14:anchorId="6E3FB75D" wp14:editId="57614218">
+            <wp:extent cx="4877481" cy="4201111"/>
+            <wp:effectExtent l="0" t="0" r="0" b="9525"/>
             <wp:docPr id="1" name="Picture 1"/>
             <wp:cNvGraphicFramePr>
               <a:graphicFrameLocks xmlns:a="http://schemas.openxmlformats.org/drawingml/2006/main" noChangeAspect="1"/>
@@ -11529,7 +11588,7 @@
                   <pic:spPr>
                     <a:xfrm>
                       <a:off x="0" y="0"/>
-                      <a:ext cx="4906060" cy="3315163"/>
+                      <a:ext cx="4877481" cy="4201111"/>
                     </a:xfrm>
                     <a:prstGeom prst="rect">
                       <a:avLst/>
@@ -11609,6 +11668,7 @@
         <w:pStyle w:val="NormalWeb"/>
         <w:spacing w:before="0" w:beforeAutospacing="0" w:after="0" w:afterAutospacing="0" w:line="360" w:lineRule="auto"/>
         <w:ind w:left="720" w:firstLine="357"/>
+        <w:jc w:val="both"/>
         <w:rPr>
           <w:sz w:val="26"/>
           <w:szCs w:val="26"/>
@@ -11648,6 +11708,7 @@
         <w:pStyle w:val="NormalWeb"/>
         <w:spacing w:before="0" w:beforeAutospacing="0" w:after="0" w:afterAutospacing="0" w:line="360" w:lineRule="auto"/>
         <w:ind w:left="720" w:firstLine="357"/>
+        <w:jc w:val="both"/>
         <w:rPr>
           <w:sz w:val="26"/>
           <w:szCs w:val="26"/>
@@ -11666,7 +11727,7 @@
           <w:szCs w:val="26"/>
           <w:lang w:val="vi-VN"/>
         </w:rPr>
-        <w:t>ba</w:t>
+        <w:t>bốn</w:t>
       </w:r>
       <w:r>
         <w:rPr>
@@ -11680,7 +11741,22 @@
           <w:sz w:val="26"/>
           <w:szCs w:val="26"/>
         </w:rPr>
-        <w:t xml:space="preserve"> khách vãng lai, người dùng (tài khoản người dùng và tài khoản cửa hàng) và admin</w:t>
+        <w:t xml:space="preserve"> khách vãng lai, </w:t>
+      </w:r>
+      <w:r>
+        <w:rPr>
+          <w:sz w:val="26"/>
+          <w:szCs w:val="26"/>
+          <w:lang w:val="vi-VN"/>
+        </w:rPr>
+        <w:t xml:space="preserve">thành viên, chủ cửa hàng </w:t>
+      </w:r>
+      <w:r>
+        <w:rPr>
+          <w:sz w:val="26"/>
+          <w:szCs w:val="26"/>
+        </w:rPr>
+        <w:t>và admin</w:t>
       </w:r>
       <w:r>
         <w:rPr>
@@ -11695,6 +11771,13 @@
           <w:szCs w:val="26"/>
         </w:rPr>
         <w:t xml:space="preserve"> </w:t>
+      </w:r>
+      <w:r>
+        <w:rPr>
+          <w:sz w:val="26"/>
+          <w:szCs w:val="26"/>
+        </w:rPr>
+        <w:t>Mỗi tác nhân tương tác với hệ thống theo các chức năng cụ thể như sau:</w:t>
       </w:r>
     </w:p>
     <w:p>
@@ -11726,6 +11809,7 @@
         </w:numPr>
         <w:spacing w:before="0" w:beforeAutospacing="0" w:after="0" w:afterAutospacing="0" w:line="360" w:lineRule="auto"/>
         <w:ind w:left="720" w:firstLine="357"/>
+        <w:jc w:val="both"/>
         <w:rPr>
           <w:rStyle w:val="Strong"/>
           <w:b w:val="0"/>
@@ -11869,6 +11953,7 @@
         </w:numPr>
         <w:spacing w:before="0" w:beforeAutospacing="0" w:after="0" w:afterAutospacing="0" w:line="360" w:lineRule="auto"/>
         <w:ind w:left="720" w:firstLine="357"/>
+        <w:jc w:val="both"/>
         <w:rPr>
           <w:rStyle w:val="Strong"/>
           <w:b w:val="0"/>
@@ -11885,12 +11970,30 @@
         </w:rPr>
         <w:t>Hệ thống sẽ tiếp nhận yêu cầu, truy xuất dữ liệu từ cơ sở dữ liệu và phản hồi kết quả hiển thị tương ứng cho khách vãng lai (2).</w:t>
       </w:r>
+    </w:p>
+    <w:p>
+      <w:pPr>
+        <w:pStyle w:val="NormalWeb"/>
+        <w:tabs>
+          <w:tab w:val="left" w:pos="720"/>
+        </w:tabs>
+        <w:spacing w:before="0" w:beforeAutospacing="0" w:after="0" w:afterAutospacing="0" w:line="360" w:lineRule="auto"/>
+        <w:ind w:left="1077"/>
+        <w:jc w:val="both"/>
+        <w:rPr>
+          <w:rStyle w:val="Strong"/>
+          <w:b w:val="0"/>
+          <w:sz w:val="26"/>
+          <w:szCs w:val="26"/>
+        </w:rPr>
+      </w:pPr>
     </w:p>
     <w:p>
       <w:pPr>
         <w:pStyle w:val="NormalWeb"/>
         <w:spacing w:before="0" w:beforeAutospacing="0" w:after="0" w:afterAutospacing="0" w:line="360" w:lineRule="auto"/>
         <w:ind w:left="360" w:firstLine="716"/>
+        <w:jc w:val="both"/>
         <w:rPr>
           <w:rStyle w:val="Strong"/>
           <w:sz w:val="26"/>
@@ -11904,15 +12007,8 @@
           <w:szCs w:val="26"/>
           <w:lang w:val="vi-VN"/>
         </w:rPr>
-        <w:t>Người dùng</w:t>
-      </w:r>
-      <w:r>
-        <w:rPr>
-          <w:rStyle w:val="Strong"/>
-          <w:sz w:val="26"/>
-          <w:szCs w:val="26"/>
-        </w:rPr>
-        <w:t xml:space="preserve"> </w:t>
+        <w:lastRenderedPageBreak/>
+        <w:t>Thành viên</w:t>
       </w:r>
     </w:p>
     <w:p>
@@ -11924,6 +12020,7 @@
         </w:numPr>
         <w:spacing w:before="0" w:beforeAutospacing="0" w:after="0" w:afterAutospacing="0" w:line="360" w:lineRule="auto"/>
         <w:ind w:left="720" w:firstLine="357"/>
+        <w:jc w:val="both"/>
         <w:rPr>
           <w:rStyle w:val="Strong"/>
           <w:b w:val="0"/>
@@ -11947,7 +12044,6 @@
           <w:sz w:val="26"/>
           <w:szCs w:val="26"/>
         </w:rPr>
-        <w:lastRenderedPageBreak/>
         <w:t>cửa</w:t>
       </w:r>
       <w:r>
@@ -12005,148 +12101,7 @@
         </w:numPr>
         <w:spacing w:before="0" w:beforeAutospacing="0" w:after="0" w:afterAutospacing="0" w:line="360" w:lineRule="auto"/>
         <w:ind w:left="720" w:firstLine="357"/>
-        <w:rPr>
-          <w:rStyle w:val="Strong"/>
-          <w:b w:val="0"/>
-          <w:sz w:val="26"/>
-          <w:szCs w:val="26"/>
-        </w:rPr>
-      </w:pPr>
-      <w:r>
-        <w:rPr>
-          <w:rStyle w:val="Strong"/>
-          <w:b w:val="0"/>
-          <w:sz w:val="26"/>
-          <w:szCs w:val="26"/>
-        </w:rPr>
-        <w:t>Tài khoản người dùng:</w:t>
-      </w:r>
-      <w:r>
-        <w:rPr>
-          <w:rStyle w:val="Strong"/>
-          <w:b w:val="0"/>
-          <w:sz w:val="26"/>
-          <w:szCs w:val="26"/>
-        </w:rPr>
-        <w:t xml:space="preserve"> </w:t>
-      </w:r>
-      <w:r>
-        <w:rPr>
-          <w:rStyle w:val="Strong"/>
-          <w:b w:val="0"/>
-          <w:sz w:val="26"/>
-          <w:szCs w:val="26"/>
-        </w:rPr>
-        <w:t>đặt mua món ă</w:t>
-      </w:r>
-      <w:r>
-        <w:rPr>
-          <w:rStyle w:val="Strong"/>
-          <w:b w:val="0"/>
-          <w:sz w:val="26"/>
-          <w:szCs w:val="26"/>
-        </w:rPr>
-        <w:t>n</w:t>
-      </w:r>
-      <w:r>
-        <w:rPr>
-          <w:rStyle w:val="Strong"/>
-          <w:b w:val="0"/>
-          <w:sz w:val="26"/>
-          <w:szCs w:val="26"/>
-        </w:rPr>
-        <w:t>; thanh toán bằng</w:t>
-      </w:r>
-      <w:r>
-        <w:rPr>
-          <w:rStyle w:val="Strong"/>
-          <w:b w:val="0"/>
-          <w:sz w:val="26"/>
-          <w:szCs w:val="26"/>
-        </w:rPr>
-        <w:t xml:space="preserve"> VNPAY – QR trực tuyến, </w:t>
-      </w:r>
-      <w:r>
-        <w:rPr>
-          <w:rStyle w:val="Strong"/>
-          <w:b w:val="0"/>
-          <w:sz w:val="26"/>
-          <w:szCs w:val="26"/>
-        </w:rPr>
-        <w:t>đánh giá chất lượng món ăn sau khi hoàn tất đơn hàng trong thời gian quy định</w:t>
-      </w:r>
-      <w:r>
-        <w:rPr>
-          <w:rStyle w:val="Strong"/>
-          <w:b w:val="0"/>
-          <w:sz w:val="26"/>
-          <w:szCs w:val="26"/>
-        </w:rPr>
-        <w:t>, có thể đăng ký mở của hàng hoặc kiếm tiền từ nội dung bài đăng.</w:t>
-      </w:r>
-    </w:p>
-    <w:p>
-      <w:pPr>
-        <w:pStyle w:val="NormalWeb"/>
-        <w:numPr>
-          <w:ilvl w:val="0"/>
-          <w:numId w:val="7"/>
-        </w:numPr>
-        <w:spacing w:before="0" w:beforeAutospacing="0" w:after="0" w:afterAutospacing="0" w:line="360" w:lineRule="auto"/>
-        <w:ind w:left="720" w:firstLine="357"/>
-        <w:rPr>
-          <w:rStyle w:val="Strong"/>
-          <w:b w:val="0"/>
-          <w:sz w:val="26"/>
-          <w:szCs w:val="26"/>
-        </w:rPr>
-      </w:pPr>
-      <w:r>
-        <w:rPr>
-          <w:rStyle w:val="Strong"/>
-          <w:b w:val="0"/>
-          <w:sz w:val="26"/>
-          <w:szCs w:val="26"/>
-        </w:rPr>
-        <w:t xml:space="preserve">Tài khoản cửa hàng: </w:t>
-      </w:r>
-      <w:r>
-        <w:rPr>
-          <w:rStyle w:val="Strong"/>
-          <w:b w:val="0"/>
-          <w:sz w:val="26"/>
-          <w:szCs w:val="26"/>
-        </w:rPr>
-        <w:t>quản lý đơn hàng, quản lý menu, quản lý doanh thu</w:t>
-      </w:r>
-      <w:r>
-        <w:rPr>
-          <w:rStyle w:val="Strong"/>
-          <w:b w:val="0"/>
-          <w:sz w:val="26"/>
-          <w:szCs w:val="26"/>
-        </w:rPr>
-        <w:t>, quản lý khuyến mãi</w:t>
-      </w:r>
-      <w:r>
-        <w:rPr>
-          <w:rStyle w:val="Strong"/>
-          <w:b w:val="0"/>
-          <w:sz w:val="26"/>
-          <w:szCs w:val="26"/>
-        </w:rPr>
-        <w:t xml:space="preserve"> của cửa hàng</w:t>
-      </w:r>
-    </w:p>
-    <w:p>
-      <w:pPr>
-        <w:pStyle w:val="NormalWeb"/>
-        <w:numPr>
-          <w:ilvl w:val="0"/>
-          <w:numId w:val="7"/>
-        </w:numPr>
-        <w:spacing w:before="0" w:beforeAutospacing="0" w:after="0" w:afterAutospacing="0" w:line="360" w:lineRule="auto"/>
-        <w:ind w:left="720" w:firstLine="357"/>
+        <w:jc w:val="both"/>
         <w:rPr>
           <w:rStyle w:val="Strong"/>
           <w:b w:val="0"/>
@@ -12176,6 +12131,7 @@
         </w:tabs>
         <w:spacing w:before="0" w:beforeAutospacing="0" w:after="0" w:afterAutospacing="0" w:line="360" w:lineRule="auto"/>
         <w:ind w:left="720" w:firstLine="357"/>
+        <w:jc w:val="both"/>
         <w:rPr>
           <w:rStyle w:val="Strong"/>
           <w:b w:val="0"/>
@@ -12198,10 +12154,12 @@
         <w:pStyle w:val="NormalWeb"/>
         <w:spacing w:before="0" w:beforeAutospacing="0" w:after="0" w:afterAutospacing="0" w:line="360" w:lineRule="auto"/>
         <w:ind w:left="360" w:firstLine="716"/>
+        <w:jc w:val="both"/>
         <w:rPr>
           <w:rStyle w:val="Strong"/>
           <w:sz w:val="26"/>
           <w:szCs w:val="26"/>
+          <w:lang w:val="vi-VN"/>
         </w:rPr>
       </w:pPr>
       <w:r>
@@ -12209,8 +12167,9 @@
           <w:rStyle w:val="Strong"/>
           <w:sz w:val="26"/>
           <w:szCs w:val="26"/>
-        </w:rPr>
-        <w:t>Admin</w:t>
+          <w:lang w:val="vi-VN"/>
+        </w:rPr>
+        <w:t>Chủ cửa hàng</w:t>
       </w:r>
     </w:p>
     <w:p>
@@ -12218,13 +12177,94 @@
         <w:pStyle w:val="NormalWeb"/>
         <w:numPr>
           <w:ilvl w:val="0"/>
-          <w:numId w:val="32"/>
+          <w:numId w:val="37"/>
+        </w:numPr>
+        <w:spacing w:before="0" w:beforeAutospacing="0" w:after="0" w:afterAutospacing="0" w:line="360" w:lineRule="auto"/>
+        <w:ind w:left="1434" w:hanging="357"/>
+        <w:jc w:val="both"/>
+        <w:rPr>
+          <w:rStyle w:val="Strong"/>
+          <w:b w:val="0"/>
+          <w:sz w:val="26"/>
+          <w:szCs w:val="26"/>
+          <w:lang w:val="vi-VN"/>
+        </w:rPr>
+      </w:pPr>
+      <w:r>
+        <w:rPr>
+          <w:rStyle w:val="Strong"/>
+          <w:b w:val="0"/>
+          <w:sz w:val="26"/>
+          <w:szCs w:val="26"/>
+          <w:lang w:val="vi-VN"/>
+        </w:rPr>
+        <w:t>Người bán hoặc nhà hàng có thể quản lý cửa hàng của mình như đăng món ăn, chỉnh sửa menu, quản lý đơn hàng, theo dõi doanh thu và tạo chương trình khuyến mãi (5).</w:t>
+      </w:r>
+    </w:p>
+    <w:p>
+      <w:pPr>
+        <w:pStyle w:val="NormalWeb"/>
+        <w:numPr>
+          <w:ilvl w:val="0"/>
+          <w:numId w:val="37"/>
+        </w:numPr>
+        <w:spacing w:before="0" w:beforeAutospacing="0" w:after="0" w:afterAutospacing="0" w:line="360" w:lineRule="auto"/>
+        <w:ind w:left="1434" w:hanging="357"/>
+        <w:jc w:val="both"/>
+        <w:rPr>
+          <w:rStyle w:val="Strong"/>
+          <w:b w:val="0"/>
+          <w:sz w:val="26"/>
+          <w:szCs w:val="26"/>
+          <w:lang w:val="vi-VN"/>
+        </w:rPr>
+      </w:pPr>
+      <w:r>
+        <w:rPr>
+          <w:rStyle w:val="Strong"/>
+          <w:b w:val="0"/>
+          <w:sz w:val="26"/>
+          <w:szCs w:val="26"/>
+          <w:lang w:val="vi-VN"/>
+        </w:rPr>
+        <w:t>Hệ thống tiếp nhận yêu cầu từ người bán, xử lý dữ liệu, cập nhật thông tin và phản hồi kết quả quản lý cho người bán (6).</w:t>
+      </w:r>
+    </w:p>
+    <w:p>
+      <w:pPr>
+        <w:pStyle w:val="NormalWeb"/>
+        <w:spacing w:before="0" w:beforeAutospacing="0" w:after="0" w:afterAutospacing="0" w:line="360" w:lineRule="auto"/>
+        <w:ind w:left="360" w:firstLine="716"/>
+        <w:jc w:val="both"/>
+        <w:rPr>
+          <w:rStyle w:val="Strong"/>
+          <w:sz w:val="26"/>
+          <w:szCs w:val="26"/>
+        </w:rPr>
+      </w:pPr>
+      <w:r>
+        <w:rPr>
+          <w:rStyle w:val="Strong"/>
+          <w:sz w:val="26"/>
+          <w:szCs w:val="26"/>
+          <w:lang w:val="vi-VN"/>
+        </w:rPr>
+        <w:t>Admin</w:t>
+      </w:r>
+    </w:p>
+    <w:p>
+      <w:pPr>
+        <w:pStyle w:val="NormalWeb"/>
+        <w:numPr>
+          <w:ilvl w:val="0"/>
+          <w:numId w:val="38"/>
         </w:numPr>
         <w:tabs>
           <w:tab w:val="left" w:pos="420"/>
+          <w:tab w:val="left" w:pos="720"/>
         </w:tabs>
         <w:spacing w:before="0" w:beforeAutospacing="0" w:after="0" w:afterAutospacing="0" w:line="360" w:lineRule="auto"/>
-        <w:ind w:left="720" w:firstLine="357"/>
+        <w:jc w:val="both"/>
         <w:rPr>
           <w:bCs/>
           <w:sz w:val="26"/>
@@ -12308,8 +12348,9 @@
           <w:bCs/>
           <w:sz w:val="26"/>
           <w:szCs w:val="26"/>
-        </w:rPr>
-        <w:t>5</w:t>
+          <w:lang w:val="vi-VN"/>
+        </w:rPr>
+        <w:t>7</w:t>
       </w:r>
       <w:r>
         <w:rPr>
@@ -12325,13 +12366,14 @@
         <w:pStyle w:val="NormalWeb"/>
         <w:numPr>
           <w:ilvl w:val="0"/>
-          <w:numId w:val="32"/>
+          <w:numId w:val="38"/>
         </w:numPr>
         <w:tabs>
           <w:tab w:val="left" w:pos="420"/>
+          <w:tab w:val="left" w:pos="720"/>
         </w:tabs>
         <w:spacing w:before="0" w:beforeAutospacing="0" w:after="0" w:afterAutospacing="0" w:line="360" w:lineRule="auto"/>
-        <w:ind w:left="720" w:firstLine="357"/>
+        <w:jc w:val="both"/>
         <w:rPr>
           <w:bCs/>
           <w:sz w:val="26"/>
@@ -12351,8 +12393,9 @@
           <w:bCs/>
           <w:sz w:val="26"/>
           <w:szCs w:val="26"/>
-        </w:rPr>
-        <w:t>6</w:t>
+          <w:lang w:val="vi-VN"/>
+        </w:rPr>
+        <w:t>8</w:t>
       </w:r>
       <w:r>
         <w:rPr>
@@ -12365,6 +12408,7 @@
     </w:p>
     <w:p>
       <w:pPr>
+        <w:jc w:val="both"/>
         <w:rPr>
           <w:lang w:val="en"/>
         </w:rPr>
@@ -12381,7 +12425,7 @@
         </w:rPr>
         <w:tab/>
       </w:r>
-      <w:bookmarkStart w:id="28" w:name="_Toc207917655"/>
+      <w:bookmarkStart w:id="29" w:name="_Toc207917655"/>
       <w:r>
         <w:rPr>
           <w:lang w:val="en"/>
@@ -12412,7 +12456,7 @@
         </w:rPr>
         <w:t>ức năng cơ bản của hệ thống</w:t>
       </w:r>
-      <w:bookmarkEnd w:id="28"/>
+      <w:bookmarkEnd w:id="29"/>
     </w:p>
     <w:p>
       <w:pPr>
@@ -12662,6 +12706,7 @@
           <w:b/>
           <w:sz w:val="26"/>
           <w:szCs w:val="26"/>
+          <w:lang w:val="vi-VN"/>
         </w:rPr>
       </w:pPr>
       <w:r>
@@ -12670,17 +12715,9 @@
           <w:b/>
           <w:sz w:val="26"/>
           <w:szCs w:val="26"/>
-        </w:rPr>
-        <w:t xml:space="preserve">Người dùng </w:t>
-      </w:r>
-      <w:r>
-        <w:rPr>
-          <w:rFonts w:ascii="Times New Roman" w:hAnsi="Times New Roman" w:cs="Times New Roman"/>
-          <w:b/>
-          <w:sz w:val="26"/>
-          <w:szCs w:val="26"/>
-        </w:rPr>
-        <w:t>(Tài khoản người dùng và Tài khoản cửa hàng)</w:t>
+          <w:lang w:val="vi-VN"/>
+        </w:rPr>
+        <w:t>Thành viên</w:t>
       </w:r>
     </w:p>
     <w:p>
@@ -12914,6 +12951,7 @@
         <w:spacing w:line="360" w:lineRule="auto"/>
         <w:rPr>
           <w:rFonts w:ascii="Times New Roman" w:hAnsi="Times New Roman" w:cs="Times New Roman"/>
+          <w:b/>
           <w:sz w:val="26"/>
           <w:szCs w:val="26"/>
         </w:rPr>
@@ -12925,32 +12963,6 @@
           <w:szCs w:val="26"/>
         </w:rPr>
         <w:t>Gửi yêu cầu hổ trợ</w:t>
-      </w:r>
-    </w:p>
-    <w:p>
-      <w:pPr>
-        <w:tabs>
-          <w:tab w:val="left" w:pos="938"/>
-          <w:tab w:val="left" w:pos="1358"/>
-          <w:tab w:val="left" w:pos="2302"/>
-        </w:tabs>
-        <w:spacing w:line="360" w:lineRule="auto"/>
-        <w:ind w:left="357" w:firstLine="714"/>
-        <w:rPr>
-          <w:rFonts w:ascii="Times New Roman" w:hAnsi="Times New Roman" w:cs="Times New Roman"/>
-          <w:b/>
-          <w:sz w:val="26"/>
-          <w:szCs w:val="26"/>
-        </w:rPr>
-      </w:pPr>
-      <w:r>
-        <w:rPr>
-          <w:rFonts w:ascii="Times New Roman" w:hAnsi="Times New Roman" w:cs="Times New Roman"/>
-          <w:b/>
-          <w:sz w:val="26"/>
-          <w:szCs w:val="26"/>
-        </w:rPr>
-        <w:t>Tài khoản người dùng</w:t>
       </w:r>
     </w:p>
     <w:p>
@@ -13145,6 +13157,7 @@
           <w:b/>
           <w:sz w:val="26"/>
           <w:szCs w:val="26"/>
+          <w:lang w:val="vi-VN"/>
         </w:rPr>
       </w:pPr>
       <w:r>
@@ -13153,8 +13166,9 @@
           <w:b/>
           <w:sz w:val="26"/>
           <w:szCs w:val="26"/>
-        </w:rPr>
-        <w:t>Tài khoản cửa hàng</w:t>
+          <w:lang w:val="vi-VN"/>
+        </w:rPr>
+        <w:t>Chủ cửa hàng</w:t>
       </w:r>
     </w:p>
     <w:p>
@@ -13294,7 +13308,6 @@
           <w:sz w:val="26"/>
           <w:szCs w:val="26"/>
         </w:rPr>
-        <w:lastRenderedPageBreak/>
         <w:t>Quản lý khuyến mãi</w:t>
       </w:r>
     </w:p>
@@ -13321,6 +13334,7 @@
           <w:sz w:val="26"/>
           <w:szCs w:val="26"/>
         </w:rPr>
+        <w:lastRenderedPageBreak/>
         <w:t>Admin</w:t>
       </w:r>
     </w:p>
@@ -13620,7 +13634,7 @@
           <w:lang w:val="vi-VN"/>
         </w:rPr>
       </w:pPr>
-      <w:bookmarkStart w:id="29" w:name="_Toc207917656"/>
+      <w:bookmarkStart w:id="30" w:name="_Toc207917656"/>
       <w:r>
         <w:rPr>
           <w:lang w:val="en"/>
@@ -13642,7 +13656,7 @@
         </w:rPr>
         <w:t>ộc</w:t>
       </w:r>
-      <w:bookmarkEnd w:id="29"/>
+      <w:bookmarkEnd w:id="30"/>
     </w:p>
     <w:p>
       <w:pPr>
@@ -14291,17 +14305,20 @@
     </w:p>
     <w:p>
       <w:pPr>
-        <w:autoSpaceDE w:val="0"/>
-        <w:autoSpaceDN w:val="0"/>
-        <w:adjustRightInd w:val="0"/>
-        <w:spacing w:line="360" w:lineRule="auto"/>
-        <w:jc w:val="both"/>
-        <w:rPr>
-          <w:rFonts w:ascii="Times New Roman" w:hAnsi="Times New Roman" w:cs="Times New Roman"/>
-          <w:sz w:val="26"/>
-          <w:szCs w:val="26"/>
-        </w:rPr>
-      </w:pPr>
+        <w:rPr>
+          <w:rFonts w:ascii="Times New Roman" w:hAnsi="Times New Roman" w:cs="Times New Roman"/>
+          <w:sz w:val="26"/>
+          <w:szCs w:val="26"/>
+        </w:rPr>
+      </w:pPr>
+      <w:r>
+        <w:rPr>
+          <w:rFonts w:ascii="Times New Roman" w:hAnsi="Times New Roman" w:cs="Times New Roman"/>
+          <w:sz w:val="26"/>
+          <w:szCs w:val="26"/>
+        </w:rPr>
+        <w:br w:type="page"/>
+      </w:r>
     </w:p>
     <w:p>
       <w:pPr>
@@ -14309,7 +14326,7 @@
         <w:spacing w:before="0" w:after="0" w:line="360" w:lineRule="auto"/>
         <w:ind w:left="357"/>
       </w:pPr>
-      <w:bookmarkStart w:id="30" w:name="_Toc207917657"/>
+      <w:bookmarkStart w:id="31" w:name="_Toc207917657"/>
       <w:r>
         <w:lastRenderedPageBreak/>
         <w:t>3</w:t>
@@ -14326,7 +14343,7 @@
         </w:rPr>
         <w:t>ÁN</w:t>
       </w:r>
-      <w:bookmarkEnd w:id="30"/>
+      <w:bookmarkEnd w:id="31"/>
     </w:p>
     <w:p>
       <w:pPr>
@@ -14336,7 +14353,7 @@
           <w:lang w:val="vi-VN"/>
         </w:rPr>
       </w:pPr>
-      <w:bookmarkStart w:id="31" w:name="_Toc207917658"/>
+      <w:bookmarkStart w:id="32" w:name="_Toc207917658"/>
       <w:r>
         <w:rPr>
           <w:lang w:val="en"/>
@@ -14349,7 +14366,7 @@
         </w:rPr>
         <w:t>Quy trình phát triển phần mềm</w:t>
       </w:r>
-      <w:bookmarkEnd w:id="31"/>
+      <w:bookmarkEnd w:id="32"/>
     </w:p>
     <w:p>
       <w:pPr>
@@ -14390,7 +14407,7 @@
           <w:lang w:val="vi-VN"/>
         </w:rPr>
       </w:pPr>
-      <w:bookmarkStart w:id="32" w:name="_Toc207917659"/>
+      <w:bookmarkStart w:id="33" w:name="_Toc207917659"/>
       <w:r>
         <w:rPr>
           <w:lang w:val="en"/>
@@ -14403,7 +14420,7 @@
         </w:rPr>
         <w:t>ả Scrum</w:t>
       </w:r>
-      <w:bookmarkEnd w:id="32"/>
+      <w:bookmarkEnd w:id="33"/>
     </w:p>
     <w:p>
       <w:pPr>
@@ -15792,7 +15809,7 @@
           <w:lang w:val="en"/>
         </w:rPr>
       </w:pPr>
-      <w:bookmarkStart w:id="33" w:name="_Toc207917660"/>
+      <w:bookmarkStart w:id="34" w:name="_Toc207917660"/>
       <w:r>
         <w:rPr>
           <w:lang w:val="en"/>
@@ -15800,7 +15817,7 @@
         <w:lastRenderedPageBreak/>
         <w:t>3.1.2 The artifacts</w:t>
       </w:r>
-      <w:bookmarkEnd w:id="33"/>
+      <w:bookmarkEnd w:id="34"/>
     </w:p>
     <w:p>
       <w:pPr>
@@ -16085,7 +16102,7 @@
           <w:lang w:val="en"/>
         </w:rPr>
       </w:pPr>
-      <w:bookmarkStart w:id="34" w:name="_Toc207917661"/>
+      <w:bookmarkStart w:id="35" w:name="_Toc207917661"/>
       <w:r>
         <w:rPr>
           <w:lang w:val="en"/>
@@ -16101,7 +16118,7 @@
       <w:r>
         <w:t>ế hoạch tổng thể</w:t>
       </w:r>
-      <w:bookmarkEnd w:id="34"/>
+      <w:bookmarkEnd w:id="35"/>
     </w:p>
     <w:p>
       <w:pPr>
@@ -16962,8 +16979,9 @@
                 <w:color w:val="000000"/>
                 <w:sz w:val="26"/>
                 <w:szCs w:val="26"/>
-              </w:rPr>
-              <w:t>7</w:t>
+                <w:lang w:val="vi-VN"/>
+              </w:rPr>
+              <w:t>4</w:t>
             </w:r>
             <w:r>
               <w:rPr>
@@ -17042,8 +17060,19 @@
                 <w:color w:val="0D0D0D"/>
                 <w:sz w:val="26"/>
                 <w:szCs w:val="26"/>
-              </w:rPr>
-              <w:t>20/03/2026</w:t>
+                <w:lang w:val="vi-VN"/>
+              </w:rPr>
+              <w:t>17</w:t>
+            </w:r>
+            <w:r>
+              <w:rPr>
+                <w:rFonts w:ascii="Times New Roman" w:eastAsia="Times New Roman" w:hAnsi="Times New Roman" w:cs="Times New Roman"/>
+                <w:b/>
+                <w:color w:val="0D0D0D"/>
+                <w:sz w:val="26"/>
+                <w:szCs w:val="26"/>
+              </w:rPr>
+              <w:t>/03/2026</w:t>
             </w:r>
           </w:p>
         </w:tc>
@@ -17329,8 +17358,18 @@
                 <w:color w:val="000000"/>
                 <w:sz w:val="26"/>
                 <w:szCs w:val="26"/>
-              </w:rPr>
-              <w:t>6 ngày</w:t>
+                <w:lang w:val="vi-VN"/>
+              </w:rPr>
+              <w:t>3</w:t>
+            </w:r>
+            <w:r>
+              <w:rPr>
+                <w:rFonts w:ascii="Times New Roman" w:eastAsia="Times New Roman" w:hAnsi="Times New Roman" w:cs="Times New Roman"/>
+                <w:color w:val="000000"/>
+                <w:sz w:val="26"/>
+                <w:szCs w:val="26"/>
+              </w:rPr>
+              <w:t xml:space="preserve"> ngày</w:t>
             </w:r>
           </w:p>
         </w:tc>
@@ -17402,16 +17441,7 @@
                 <w:szCs w:val="26"/>
                 <w:lang w:val="vi-VN"/>
               </w:rPr>
-              <w:t>2</w:t>
-            </w:r>
-            <w:r>
-              <w:rPr>
-                <w:rFonts w:ascii="Times New Roman" w:eastAsia="Times New Roman" w:hAnsi="Times New Roman" w:cs="Times New Roman"/>
-                <w:color w:val="0D0D0D"/>
-                <w:sz w:val="26"/>
-                <w:szCs w:val="26"/>
-              </w:rPr>
-              <w:t>0</w:t>
+              <w:t>17</w:t>
             </w:r>
             <w:r>
               <w:rPr>
@@ -17523,7 +17553,7 @@
                 <w:szCs w:val="26"/>
                 <w:lang w:val="vi-VN"/>
               </w:rPr>
-              <w:t>57</w:t>
+              <w:t>51</w:t>
             </w:r>
             <w:r>
               <w:rPr>
@@ -17563,17 +17593,7 @@
                 <w:szCs w:val="26"/>
                 <w:lang w:val="vi-VN"/>
               </w:rPr>
-              <w:t>2</w:t>
-            </w:r>
-            <w:r>
-              <w:rPr>
-                <w:rFonts w:ascii="Times New Roman" w:eastAsia="Times New Roman" w:hAnsi="Times New Roman" w:cs="Times New Roman"/>
-                <w:b/>
-                <w:color w:val="0D0D0D"/>
-                <w:sz w:val="26"/>
-                <w:szCs w:val="26"/>
-              </w:rPr>
-              <w:t>1</w:t>
+              <w:t>18</w:t>
             </w:r>
             <w:r>
               <w:rPr>
@@ -17624,7 +17644,7 @@
                 <w:szCs w:val="26"/>
                 <w:lang w:val="vi-VN"/>
               </w:rPr>
-              <w:t>16</w:t>
+              <w:t>08</w:t>
             </w:r>
             <w:r>
               <w:rPr>
@@ -17729,7 +17749,7 @@
                 <w:szCs w:val="26"/>
                 <w:lang w:val="vi-VN"/>
               </w:rPr>
-              <w:t>18</w:t>
+              <w:t>13</w:t>
             </w:r>
             <w:r>
               <w:rPr>
@@ -17763,8 +17783,9 @@
                 <w:color w:val="000000"/>
                 <w:sz w:val="26"/>
                 <w:szCs w:val="26"/>
-              </w:rPr>
-              <w:t>21</w:t>
+                <w:lang w:val="vi-VN"/>
+              </w:rPr>
+              <w:t>18</w:t>
             </w:r>
             <w:r>
               <w:rPr>
@@ -17810,7 +17831,7 @@
                 <w:szCs w:val="26"/>
                 <w:lang w:val="vi-VN"/>
               </w:rPr>
-              <w:t>07</w:t>
+              <w:t>30/03</w:t>
             </w:r>
             <w:r>
               <w:rPr>
@@ -17820,7 +17841,7 @@
                 <w:szCs w:val="26"/>
                 <w:lang w:val="vi-VN"/>
               </w:rPr>
-              <w:t>/04/202</w:t>
+              <w:t>/202</w:t>
             </w:r>
             <w:r>
               <w:rPr>
@@ -17913,7 +17934,7 @@
                 <w:szCs w:val="26"/>
                 <w:lang w:val="vi-VN"/>
               </w:rPr>
-              <w:t>20</w:t>
+              <w:t>19</w:t>
             </w:r>
             <w:r>
               <w:rPr>
@@ -17959,7 +17980,7 @@
                 <w:szCs w:val="26"/>
                 <w:lang w:val="vi-VN"/>
               </w:rPr>
-              <w:t>08</w:t>
+              <w:t>31/03</w:t>
             </w:r>
             <w:r>
               <w:rPr>
@@ -17969,7 +17990,7 @@
                 <w:szCs w:val="26"/>
                 <w:lang w:val="vi-VN"/>
               </w:rPr>
-              <w:t>/04/202</w:t>
+              <w:t>/202</w:t>
             </w:r>
             <w:r>
               <w:rPr>
@@ -18005,7 +18026,7 @@
                 <w:szCs w:val="26"/>
                 <w:lang w:val="vi-VN"/>
               </w:rPr>
-              <w:t>27</w:t>
+              <w:t>18/</w:t>
             </w:r>
             <w:r>
               <w:rPr>
@@ -18015,7 +18036,7 @@
                 <w:szCs w:val="26"/>
                 <w:lang w:val="vi-VN"/>
               </w:rPr>
-              <w:t>/04/202</w:t>
+              <w:t>04/202</w:t>
             </w:r>
             <w:r>
               <w:rPr>
@@ -18144,7 +18165,7 @@
                 <w:szCs w:val="26"/>
                 <w:lang w:val="vi-VN"/>
               </w:rPr>
-              <w:t>28</w:t>
+              <w:t>19</w:t>
             </w:r>
             <w:r>
               <w:rPr>
@@ -18190,7 +18211,7 @@
                 <w:szCs w:val="26"/>
                 <w:lang w:val="vi-VN"/>
               </w:rPr>
-              <w:t>16</w:t>
+              <w:t>08</w:t>
             </w:r>
             <w:r>
               <w:rPr>
@@ -18331,7 +18352,7 @@
                 <w:szCs w:val="26"/>
                 <w:lang w:val="vi-VN"/>
               </w:rPr>
-              <w:t>17</w:t>
+              <w:t>09</w:t>
             </w:r>
             <w:r>
               <w:rPr>
@@ -18382,7 +18403,7 @@
                 <w:szCs w:val="26"/>
                 <w:lang w:val="vi-VN"/>
               </w:rPr>
-              <w:t>17</w:t>
+              <w:t>09</w:t>
             </w:r>
             <w:r>
               <w:rPr>
@@ -18536,7 +18557,7 @@
                 <w:szCs w:val="26"/>
                 <w:lang w:val="vi-VN"/>
               </w:rPr>
-              <w:t>18</w:t>
+              <w:t>10</w:t>
             </w:r>
             <w:r>
               <w:rPr>
@@ -18597,7 +18618,7 @@
                 <w:szCs w:val="26"/>
                 <w:lang w:val="vi-VN"/>
               </w:rPr>
-              <w:t>18</w:t>
+              <w:t>10</w:t>
             </w:r>
             <w:r>
               <w:rPr>
@@ -18748,8 +18769,6 @@
           <w:lang w:val="en"/>
         </w:rPr>
       </w:pPr>
-      <w:bookmarkStart w:id="35" w:name="_GoBack"/>
-      <w:bookmarkEnd w:id="35"/>
     </w:p>
     <w:p>
       <w:pPr>
@@ -21679,7 +21698,7 @@
         <w:sz w:val="26"/>
         <w:szCs w:val="26"/>
       </w:rPr>
-      <w:t>17</w:t>
+      <w:t>18</w:t>
     </w:r>
     <w:r>
       <w:rPr>
@@ -23516,6 +23535,119 @@
     </w:lvl>
   </w:abstractNum>
   <w:abstractNum w:abstractNumId="14" w15:restartNumberingAfterBreak="0">
+    <w:nsid w:val="2BBF06CA"/>
+    <w:multiLevelType w:val="hybridMultilevel"/>
+    <w:tmpl w:val="4F3E9746"/>
+    <w:lvl w:ilvl="0" w:tplc="042A0001">
+      <w:start w:val="1"/>
+      <w:numFmt w:val="bullet"/>
+      <w:lvlText w:val=""/>
+      <w:lvlJc w:val="left"/>
+      <w:pPr>
+        <w:ind w:left="1436" w:hanging="360"/>
+      </w:pPr>
+      <w:rPr>
+        <w:rFonts w:ascii="Symbol" w:hAnsi="Symbol" w:hint="default"/>
+      </w:rPr>
+    </w:lvl>
+    <w:lvl w:ilvl="1" w:tplc="042A0003" w:tentative="1">
+      <w:start w:val="1"/>
+      <w:numFmt w:val="bullet"/>
+      <w:lvlText w:val="o"/>
+      <w:lvlJc w:val="left"/>
+      <w:pPr>
+        <w:ind w:left="2156" w:hanging="360"/>
+      </w:pPr>
+      <w:rPr>
+        <w:rFonts w:ascii="Courier New" w:hAnsi="Courier New" w:cs="Courier New" w:hint="default"/>
+      </w:rPr>
+    </w:lvl>
+    <w:lvl w:ilvl="2" w:tplc="042A0005" w:tentative="1">
+      <w:start w:val="1"/>
+      <w:numFmt w:val="bullet"/>
+      <w:lvlText w:val=""/>
+      <w:lvlJc w:val="left"/>
+      <w:pPr>
+        <w:ind w:left="2876" w:hanging="360"/>
+      </w:pPr>
+      <w:rPr>
+        <w:rFonts w:ascii="Wingdings" w:hAnsi="Wingdings" w:hint="default"/>
+      </w:rPr>
+    </w:lvl>
+    <w:lvl w:ilvl="3" w:tplc="042A0001" w:tentative="1">
+      <w:start w:val="1"/>
+      <w:numFmt w:val="bullet"/>
+      <w:lvlText w:val=""/>
+      <w:lvlJc w:val="left"/>
+      <w:pPr>
+        <w:ind w:left="3596" w:hanging="360"/>
+      </w:pPr>
+      <w:rPr>
+        <w:rFonts w:ascii="Symbol" w:hAnsi="Symbol" w:hint="default"/>
+      </w:rPr>
+    </w:lvl>
+    <w:lvl w:ilvl="4" w:tplc="042A0003" w:tentative="1">
+      <w:start w:val="1"/>
+      <w:numFmt w:val="bullet"/>
+      <w:lvlText w:val="o"/>
+      <w:lvlJc w:val="left"/>
+      <w:pPr>
+        <w:ind w:left="4316" w:hanging="360"/>
+      </w:pPr>
+      <w:rPr>
+        <w:rFonts w:ascii="Courier New" w:hAnsi="Courier New" w:cs="Courier New" w:hint="default"/>
+      </w:rPr>
+    </w:lvl>
+    <w:lvl w:ilvl="5" w:tplc="042A0005" w:tentative="1">
+      <w:start w:val="1"/>
+      <w:numFmt w:val="bullet"/>
+      <w:lvlText w:val=""/>
+      <w:lvlJc w:val="left"/>
+      <w:pPr>
+        <w:ind w:left="5036" w:hanging="360"/>
+      </w:pPr>
+      <w:rPr>
+        <w:rFonts w:ascii="Wingdings" w:hAnsi="Wingdings" w:hint="default"/>
+      </w:rPr>
+    </w:lvl>
+    <w:lvl w:ilvl="6" w:tplc="042A0001" w:tentative="1">
+      <w:start w:val="1"/>
+      <w:numFmt w:val="bullet"/>
+      <w:lvlText w:val=""/>
+      <w:lvlJc w:val="left"/>
+      <w:pPr>
+        <w:ind w:left="5756" w:hanging="360"/>
+      </w:pPr>
+      <w:rPr>
+        <w:rFonts w:ascii="Symbol" w:hAnsi="Symbol" w:hint="default"/>
+      </w:rPr>
+    </w:lvl>
+    <w:lvl w:ilvl="7" w:tplc="042A0003" w:tentative="1">
+      <w:start w:val="1"/>
+      <w:numFmt w:val="bullet"/>
+      <w:lvlText w:val="o"/>
+      <w:lvlJc w:val="left"/>
+      <w:pPr>
+        <w:ind w:left="6476" w:hanging="360"/>
+      </w:pPr>
+      <w:rPr>
+        <w:rFonts w:ascii="Courier New" w:hAnsi="Courier New" w:cs="Courier New" w:hint="default"/>
+      </w:rPr>
+    </w:lvl>
+    <w:lvl w:ilvl="8" w:tplc="042A0005" w:tentative="1">
+      <w:start w:val="1"/>
+      <w:numFmt w:val="bullet"/>
+      <w:lvlText w:val=""/>
+      <w:lvlJc w:val="left"/>
+      <w:pPr>
+        <w:ind w:left="7196" w:hanging="360"/>
+      </w:pPr>
+      <w:rPr>
+        <w:rFonts w:ascii="Wingdings" w:hAnsi="Wingdings" w:hint="default"/>
+      </w:rPr>
+    </w:lvl>
+  </w:abstractNum>
+  <w:abstractNum w:abstractNumId="15" w15:restartNumberingAfterBreak="0">
     <w:nsid w:val="31066239"/>
     <w:multiLevelType w:val="multilevel"/>
     <w:tmpl w:val="C41E266A"/>
@@ -23655,7 +23787,7 @@
       </w:rPr>
     </w:lvl>
   </w:abstractNum>
-  <w:abstractNum w:abstractNumId="15" w15:restartNumberingAfterBreak="0">
+  <w:abstractNum w:abstractNumId="16" w15:restartNumberingAfterBreak="0">
     <w:nsid w:val="36E102A4"/>
     <w:multiLevelType w:val="hybridMultilevel"/>
     <w:tmpl w:val="0E065E2E"/>
@@ -23768,7 +23900,7 @@
       </w:rPr>
     </w:lvl>
   </w:abstractNum>
-  <w:abstractNum w:abstractNumId="16" w15:restartNumberingAfterBreak="0">
+  <w:abstractNum w:abstractNumId="17" w15:restartNumberingAfterBreak="0">
     <w:nsid w:val="3E272384"/>
     <w:multiLevelType w:val="multilevel"/>
     <w:tmpl w:val="3E272384"/>
@@ -23880,7 +24012,7 @@
       </w:rPr>
     </w:lvl>
   </w:abstractNum>
-  <w:abstractNum w:abstractNumId="17" w15:restartNumberingAfterBreak="0">
+  <w:abstractNum w:abstractNumId="18" w15:restartNumberingAfterBreak="0">
     <w:nsid w:val="46A858AF"/>
     <w:multiLevelType w:val="hybridMultilevel"/>
     <w:tmpl w:val="D7AA3B6C"/>
@@ -23993,7 +24125,7 @@
       </w:rPr>
     </w:lvl>
   </w:abstractNum>
-  <w:abstractNum w:abstractNumId="18" w15:restartNumberingAfterBreak="0">
+  <w:abstractNum w:abstractNumId="19" w15:restartNumberingAfterBreak="0">
     <w:nsid w:val="46F74639"/>
     <w:multiLevelType w:val="multilevel"/>
     <w:tmpl w:val="8A1001CC"/>
@@ -24133,7 +24265,7 @@
       </w:rPr>
     </w:lvl>
   </w:abstractNum>
-  <w:abstractNum w:abstractNumId="19" w15:restartNumberingAfterBreak="0">
+  <w:abstractNum w:abstractNumId="20" w15:restartNumberingAfterBreak="0">
     <w:nsid w:val="4B024EAF"/>
     <w:multiLevelType w:val="multilevel"/>
     <w:tmpl w:val="A2CCF69C"/>
@@ -24273,7 +24405,7 @@
       </w:rPr>
     </w:lvl>
   </w:abstractNum>
-  <w:abstractNum w:abstractNumId="20" w15:restartNumberingAfterBreak="0">
+  <w:abstractNum w:abstractNumId="21" w15:restartNumberingAfterBreak="0">
     <w:nsid w:val="4BC878B5"/>
     <w:multiLevelType w:val="multilevel"/>
     <w:tmpl w:val="4BC878B5"/>
@@ -24386,7 +24518,7 @@
       </w:rPr>
     </w:lvl>
   </w:abstractNum>
-  <w:abstractNum w:abstractNumId="21" w15:restartNumberingAfterBreak="0">
+  <w:abstractNum w:abstractNumId="22" w15:restartNumberingAfterBreak="0">
     <w:nsid w:val="4C830EB8"/>
     <w:multiLevelType w:val="multilevel"/>
     <w:tmpl w:val="6A861C00"/>
@@ -24500,7 +24632,7 @@
       </w:rPr>
     </w:lvl>
   </w:abstractNum>
-  <w:abstractNum w:abstractNumId="22" w15:restartNumberingAfterBreak="0">
+  <w:abstractNum w:abstractNumId="23" w15:restartNumberingAfterBreak="0">
     <w:nsid w:val="4CC722D6"/>
     <w:multiLevelType w:val="multilevel"/>
     <w:tmpl w:val="8A1001CC"/>
@@ -24640,7 +24772,7 @@
       </w:rPr>
     </w:lvl>
   </w:abstractNum>
-  <w:abstractNum w:abstractNumId="23" w15:restartNumberingAfterBreak="0">
+  <w:abstractNum w:abstractNumId="24" w15:restartNumberingAfterBreak="0">
     <w:nsid w:val="4D5E65CC"/>
     <w:multiLevelType w:val="hybridMultilevel"/>
     <w:tmpl w:val="088AF390"/>
@@ -24753,7 +24885,7 @@
       </w:rPr>
     </w:lvl>
   </w:abstractNum>
-  <w:abstractNum w:abstractNumId="24" w15:restartNumberingAfterBreak="0">
+  <w:abstractNum w:abstractNumId="25" w15:restartNumberingAfterBreak="0">
     <w:nsid w:val="53C31C31"/>
     <w:multiLevelType w:val="multilevel"/>
     <w:tmpl w:val="55F8643E"/>
@@ -24893,7 +25025,7 @@
       </w:rPr>
     </w:lvl>
   </w:abstractNum>
-  <w:abstractNum w:abstractNumId="25" w15:restartNumberingAfterBreak="0">
+  <w:abstractNum w:abstractNumId="26" w15:restartNumberingAfterBreak="0">
     <w:nsid w:val="59A43F13"/>
     <w:multiLevelType w:val="multilevel"/>
     <w:tmpl w:val="E230F3D6"/>
@@ -25006,7 +25138,7 @@
       </w:rPr>
     </w:lvl>
   </w:abstractNum>
-  <w:abstractNum w:abstractNumId="26" w15:restartNumberingAfterBreak="0">
+  <w:abstractNum w:abstractNumId="27" w15:restartNumberingAfterBreak="0">
     <w:nsid w:val="5F9F12F7"/>
     <w:multiLevelType w:val="hybridMultilevel"/>
     <w:tmpl w:val="81B0D110"/>
@@ -25119,7 +25251,7 @@
       </w:rPr>
     </w:lvl>
   </w:abstractNum>
-  <w:abstractNum w:abstractNumId="27" w15:restartNumberingAfterBreak="0">
+  <w:abstractNum w:abstractNumId="28" w15:restartNumberingAfterBreak="0">
     <w:nsid w:val="60753E21"/>
     <w:multiLevelType w:val="multilevel"/>
     <w:tmpl w:val="A02AEA12"/>
@@ -25259,7 +25391,7 @@
       </w:rPr>
     </w:lvl>
   </w:abstractNum>
-  <w:abstractNum w:abstractNumId="28" w15:restartNumberingAfterBreak="0">
+  <w:abstractNum w:abstractNumId="29" w15:restartNumberingAfterBreak="0">
     <w:nsid w:val="612752FA"/>
     <w:multiLevelType w:val="multilevel"/>
     <w:tmpl w:val="612752FA"/>
@@ -25353,7 +25485,7 @@
       </w:pPr>
     </w:lvl>
   </w:abstractNum>
-  <w:abstractNum w:abstractNumId="29" w15:restartNumberingAfterBreak="0">
+  <w:abstractNum w:abstractNumId="30" w15:restartNumberingAfterBreak="0">
     <w:nsid w:val="65775B96"/>
     <w:multiLevelType w:val="multilevel"/>
     <w:tmpl w:val="A02AEA12"/>
@@ -25493,7 +25625,7 @@
       </w:rPr>
     </w:lvl>
   </w:abstractNum>
-  <w:abstractNum w:abstractNumId="30" w15:restartNumberingAfterBreak="0">
+  <w:abstractNum w:abstractNumId="31" w15:restartNumberingAfterBreak="0">
     <w:nsid w:val="6B64182D"/>
     <w:multiLevelType w:val="multilevel"/>
     <w:tmpl w:val="A02AEA12"/>
@@ -25633,7 +25765,7 @@
       </w:rPr>
     </w:lvl>
   </w:abstractNum>
-  <w:abstractNum w:abstractNumId="31" w15:restartNumberingAfterBreak="0">
+  <w:abstractNum w:abstractNumId="32" w15:restartNumberingAfterBreak="0">
     <w:nsid w:val="6DC31E06"/>
     <w:multiLevelType w:val="multilevel"/>
     <w:tmpl w:val="6DC31E06"/>
@@ -25722,7 +25854,7 @@
       </w:pPr>
     </w:lvl>
   </w:abstractNum>
-  <w:abstractNum w:abstractNumId="32" w15:restartNumberingAfterBreak="0">
+  <w:abstractNum w:abstractNumId="33" w15:restartNumberingAfterBreak="0">
     <w:nsid w:val="711D3D6F"/>
     <w:multiLevelType w:val="hybridMultilevel"/>
     <w:tmpl w:val="1AACA0F2"/>
@@ -25835,7 +25967,120 @@
       </w:rPr>
     </w:lvl>
   </w:abstractNum>
-  <w:abstractNum w:abstractNumId="33" w15:restartNumberingAfterBreak="0">
+  <w:abstractNum w:abstractNumId="34" w15:restartNumberingAfterBreak="0">
+    <w:nsid w:val="76C373CF"/>
+    <w:multiLevelType w:val="hybridMultilevel"/>
+    <w:tmpl w:val="3D28A6BA"/>
+    <w:lvl w:ilvl="0" w:tplc="042A0001">
+      <w:start w:val="1"/>
+      <w:numFmt w:val="bullet"/>
+      <w:lvlText w:val=""/>
+      <w:lvlJc w:val="left"/>
+      <w:pPr>
+        <w:ind w:left="1436" w:hanging="360"/>
+      </w:pPr>
+      <w:rPr>
+        <w:rFonts w:ascii="Symbol" w:hAnsi="Symbol" w:hint="default"/>
+      </w:rPr>
+    </w:lvl>
+    <w:lvl w:ilvl="1" w:tplc="042A0003" w:tentative="1">
+      <w:start w:val="1"/>
+      <w:numFmt w:val="bullet"/>
+      <w:lvlText w:val="o"/>
+      <w:lvlJc w:val="left"/>
+      <w:pPr>
+        <w:ind w:left="2156" w:hanging="360"/>
+      </w:pPr>
+      <w:rPr>
+        <w:rFonts w:ascii="Courier New" w:hAnsi="Courier New" w:cs="Courier New" w:hint="default"/>
+      </w:rPr>
+    </w:lvl>
+    <w:lvl w:ilvl="2" w:tplc="042A0005" w:tentative="1">
+      <w:start w:val="1"/>
+      <w:numFmt w:val="bullet"/>
+      <w:lvlText w:val=""/>
+      <w:lvlJc w:val="left"/>
+      <w:pPr>
+        <w:ind w:left="2876" w:hanging="360"/>
+      </w:pPr>
+      <w:rPr>
+        <w:rFonts w:ascii="Wingdings" w:hAnsi="Wingdings" w:hint="default"/>
+      </w:rPr>
+    </w:lvl>
+    <w:lvl w:ilvl="3" w:tplc="042A0001" w:tentative="1">
+      <w:start w:val="1"/>
+      <w:numFmt w:val="bullet"/>
+      <w:lvlText w:val=""/>
+      <w:lvlJc w:val="left"/>
+      <w:pPr>
+        <w:ind w:left="3596" w:hanging="360"/>
+      </w:pPr>
+      <w:rPr>
+        <w:rFonts w:ascii="Symbol" w:hAnsi="Symbol" w:hint="default"/>
+      </w:rPr>
+    </w:lvl>
+    <w:lvl w:ilvl="4" w:tplc="042A0003" w:tentative="1">
+      <w:start w:val="1"/>
+      <w:numFmt w:val="bullet"/>
+      <w:lvlText w:val="o"/>
+      <w:lvlJc w:val="left"/>
+      <w:pPr>
+        <w:ind w:left="4316" w:hanging="360"/>
+      </w:pPr>
+      <w:rPr>
+        <w:rFonts w:ascii="Courier New" w:hAnsi="Courier New" w:cs="Courier New" w:hint="default"/>
+      </w:rPr>
+    </w:lvl>
+    <w:lvl w:ilvl="5" w:tplc="042A0005" w:tentative="1">
+      <w:start w:val="1"/>
+      <w:numFmt w:val="bullet"/>
+      <w:lvlText w:val=""/>
+      <w:lvlJc w:val="left"/>
+      <w:pPr>
+        <w:ind w:left="5036" w:hanging="360"/>
+      </w:pPr>
+      <w:rPr>
+        <w:rFonts w:ascii="Wingdings" w:hAnsi="Wingdings" w:hint="default"/>
+      </w:rPr>
+    </w:lvl>
+    <w:lvl w:ilvl="6" w:tplc="042A0001" w:tentative="1">
+      <w:start w:val="1"/>
+      <w:numFmt w:val="bullet"/>
+      <w:lvlText w:val=""/>
+      <w:lvlJc w:val="left"/>
+      <w:pPr>
+        <w:ind w:left="5756" w:hanging="360"/>
+      </w:pPr>
+      <w:rPr>
+        <w:rFonts w:ascii="Symbol" w:hAnsi="Symbol" w:hint="default"/>
+      </w:rPr>
+    </w:lvl>
+    <w:lvl w:ilvl="7" w:tplc="042A0003" w:tentative="1">
+      <w:start w:val="1"/>
+      <w:numFmt w:val="bullet"/>
+      <w:lvlText w:val="o"/>
+      <w:lvlJc w:val="left"/>
+      <w:pPr>
+        <w:ind w:left="6476" w:hanging="360"/>
+      </w:pPr>
+      <w:rPr>
+        <w:rFonts w:ascii="Courier New" w:hAnsi="Courier New" w:cs="Courier New" w:hint="default"/>
+      </w:rPr>
+    </w:lvl>
+    <w:lvl w:ilvl="8" w:tplc="042A0005" w:tentative="1">
+      <w:start w:val="1"/>
+      <w:numFmt w:val="bullet"/>
+      <w:lvlText w:val=""/>
+      <w:lvlJc w:val="left"/>
+      <w:pPr>
+        <w:ind w:left="7196" w:hanging="360"/>
+      </w:pPr>
+      <w:rPr>
+        <w:rFonts w:ascii="Wingdings" w:hAnsi="Wingdings" w:hint="default"/>
+      </w:rPr>
+    </w:lvl>
+  </w:abstractNum>
+  <w:abstractNum w:abstractNumId="35" w15:restartNumberingAfterBreak="0">
     <w:nsid w:val="7C1A4303"/>
     <w:multiLevelType w:val="multilevel"/>
     <w:tmpl w:val="A02AEA12"/>
@@ -25975,7 +26220,7 @@
       </w:rPr>
     </w:lvl>
   </w:abstractNum>
-  <w:abstractNum w:abstractNumId="34" w15:restartNumberingAfterBreak="0">
+  <w:abstractNum w:abstractNumId="36" w15:restartNumberingAfterBreak="0">
     <w:nsid w:val="7D6554F0"/>
     <w:multiLevelType w:val="multilevel"/>
     <w:tmpl w:val="7D6554F0"/>
@@ -26124,7 +26369,7 @@
       </w:rPr>
     </w:lvl>
   </w:abstractNum>
-  <w:abstractNum w:abstractNumId="35" w15:restartNumberingAfterBreak="0">
+  <w:abstractNum w:abstractNumId="37" w15:restartNumberingAfterBreak="0">
     <w:nsid w:val="7E8176DE"/>
     <w:multiLevelType w:val="hybridMultilevel"/>
     <w:tmpl w:val="CD06E966"/>
@@ -26238,19 +26483,19 @@
     </w:lvl>
   </w:abstractNum>
   <w:num w:numId="1">
-    <w:abstractNumId w:val="28"/>
+    <w:abstractNumId w:val="29"/>
   </w:num>
   <w:num w:numId="2">
-    <w:abstractNumId w:val="31"/>
+    <w:abstractNumId w:val="32"/>
   </w:num>
   <w:num w:numId="3">
     <w:abstractNumId w:val="2"/>
   </w:num>
   <w:num w:numId="4">
-    <w:abstractNumId w:val="16"/>
+    <w:abstractNumId w:val="17"/>
   </w:num>
   <w:num w:numId="5">
-    <w:abstractNumId w:val="20"/>
+    <w:abstractNumId w:val="21"/>
   </w:num>
   <w:num w:numId="6">
     <w:abstractNumId w:val="7"/>
@@ -26262,7 +26507,7 @@
     <w:abstractNumId w:val="5"/>
   </w:num>
   <w:num w:numId="9">
-    <w:abstractNumId w:val="34"/>
+    <w:abstractNumId w:val="36"/>
   </w:num>
   <w:num w:numId="10">
     <w:abstractNumId w:val="11"/>
@@ -26274,19 +26519,19 @@
     <w:abstractNumId w:val="4"/>
   </w:num>
   <w:num w:numId="13">
-    <w:abstractNumId w:val="23"/>
+    <w:abstractNumId w:val="24"/>
   </w:num>
   <w:num w:numId="14">
-    <w:abstractNumId w:val="35"/>
+    <w:abstractNumId w:val="37"/>
   </w:num>
   <w:num w:numId="15">
-    <w:abstractNumId w:val="32"/>
+    <w:abstractNumId w:val="33"/>
   </w:num>
   <w:num w:numId="16">
-    <w:abstractNumId w:val="17"/>
+    <w:abstractNumId w:val="18"/>
   </w:num>
   <w:num w:numId="17">
-    <w:abstractNumId w:val="15"/>
+    <w:abstractNumId w:val="16"/>
   </w:num>
   <w:num w:numId="18">
     <w:abstractNumId w:val="9"/>
@@ -26301,19 +26546,19 @@
     <w:abstractNumId w:val="10"/>
   </w:num>
   <w:num w:numId="22">
-    <w:abstractNumId w:val="18"/>
+    <w:abstractNumId w:val="19"/>
   </w:num>
   <w:num w:numId="23">
-    <w:abstractNumId w:val="22"/>
+    <w:abstractNumId w:val="23"/>
   </w:num>
   <w:num w:numId="24">
-    <w:abstractNumId w:val="29"/>
+    <w:abstractNumId w:val="30"/>
   </w:num>
   <w:num w:numId="25">
-    <w:abstractNumId w:val="27"/>
+    <w:abstractNumId w:val="28"/>
   </w:num>
   <w:num w:numId="26">
-    <w:abstractNumId w:val="30"/>
+    <w:abstractNumId w:val="31"/>
   </w:num>
   <w:num w:numId="27">
     <w:abstractNumId w:val="8"/>
@@ -26322,28 +26567,34 @@
     <w:abstractNumId w:val="12"/>
   </w:num>
   <w:num w:numId="29">
-    <w:abstractNumId w:val="33"/>
+    <w:abstractNumId w:val="35"/>
   </w:num>
   <w:num w:numId="30">
-    <w:abstractNumId w:val="14"/>
+    <w:abstractNumId w:val="15"/>
   </w:num>
   <w:num w:numId="31">
-    <w:abstractNumId w:val="24"/>
+    <w:abstractNumId w:val="25"/>
   </w:num>
   <w:num w:numId="32">
-    <w:abstractNumId w:val="19"/>
+    <w:abstractNumId w:val="20"/>
   </w:num>
   <w:num w:numId="33">
-    <w:abstractNumId w:val="25"/>
+    <w:abstractNumId w:val="26"/>
   </w:num>
   <w:num w:numId="34">
-    <w:abstractNumId w:val="26"/>
+    <w:abstractNumId w:val="27"/>
   </w:num>
   <w:num w:numId="35">
-    <w:abstractNumId w:val="21"/>
+    <w:abstractNumId w:val="22"/>
   </w:num>
   <w:num w:numId="36">
     <w:abstractNumId w:val="13"/>
+  </w:num>
+  <w:num w:numId="37">
+    <w:abstractNumId w:val="34"/>
+  </w:num>
+  <w:num w:numId="38">
+    <w:abstractNumId w:val="14"/>
   </w:num>
 </w:numbering>
 </file>
@@ -27660,7 +27911,7 @@
 </file>
 
 <file path=customXml/itemProps1.xml><?xml version="1.0" encoding="utf-8"?>
-<ds:datastoreItem xmlns:ds="http://schemas.openxmlformats.org/officeDocument/2006/customXml" ds:itemID="{B3A6681C-D7E2-4923-88EF-AE6570629D42}">
+<ds:datastoreItem xmlns:ds="http://schemas.openxmlformats.org/officeDocument/2006/customXml" ds:itemID="{34D66BBA-511B-45ED-9B6D-444E3A892452}">
   <ds:schemaRefs>
     <ds:schemaRef ds:uri="http://schemas.openxmlformats.org/officeDocument/2006/bibliography"/>
   </ds:schemaRefs>

</xml_diff>